<commit_message>
reverse places of signers in and rev. no. in the acceptance docs
</commit_message>
<xml_diff>
--- a/backend/templates/docx/810_3_1.docx
+++ b/backend/templates/docx/810_3_1.docx
@@ -21,8 +21,6 @@
         </w:rPr>
         <w:t>81</w:t>
       </w:r>
-      <w:bookmarkStart w:id="0" w:name="_GoBack"/>
-      <w:bookmarkEnd w:id="0"/>
       <w:r>
         <w:rPr>
           <w:b/>
@@ -71,8 +69,9 @@
           <w:b/>
           <w:sz w:val="22"/>
           <w:szCs w:val="22"/>
-        </w:rPr>
-        <w:t>1</w:t>
+          <w:lang w:val="en-US"/>
+        </w:rPr>
+        <w:t>9</w:t>
       </w:r>
       <w:r>
         <w:rPr>
@@ -185,11 +184,11 @@
         <w:tblLook w:val="04A0" w:firstRow="1" w:lastRow="0" w:firstColumn="1" w:lastColumn="0" w:noHBand="0" w:noVBand="1"/>
       </w:tblPr>
       <w:tblGrid>
-        <w:gridCol w:w="2630"/>
-        <w:gridCol w:w="1860"/>
+        <w:gridCol w:w="2589"/>
+        <w:gridCol w:w="1825"/>
         <w:gridCol w:w="435"/>
-        <w:gridCol w:w="1694"/>
-        <w:gridCol w:w="2418"/>
+        <w:gridCol w:w="1636"/>
+        <w:gridCol w:w="2336"/>
       </w:tblGrid>
       <w:tr>
         <w:tc>
@@ -3046,64 +3045,87 @@
           <w:sz w:val="22"/>
           <w:szCs w:val="22"/>
         </w:rPr>
-        <w:t>Заказчик:</w:t>
-      </w:r>
-      <w:r>
-        <w:rPr>
-          <w:b/>
-          <w:sz w:val="22"/>
-          <w:szCs w:val="22"/>
-        </w:rPr>
-        <w:tab/>
-      </w:r>
-      <w:r>
-        <w:rPr>
-          <w:b/>
-          <w:sz w:val="22"/>
-          <w:szCs w:val="22"/>
-        </w:rPr>
-        <w:tab/>
-      </w:r>
-      <w:r>
-        <w:rPr>
-          <w:b/>
-          <w:sz w:val="22"/>
-          <w:szCs w:val="22"/>
-        </w:rPr>
-        <w:tab/>
-      </w:r>
-      <w:r>
-        <w:rPr>
-          <w:b/>
-          <w:sz w:val="22"/>
-          <w:szCs w:val="22"/>
-        </w:rPr>
-        <w:tab/>
-      </w:r>
-      <w:r>
-        <w:rPr>
-          <w:b/>
-          <w:sz w:val="22"/>
-          <w:szCs w:val="22"/>
-        </w:rPr>
-        <w:tab/>
-      </w:r>
-      <w:r>
-        <w:rPr>
-          <w:b/>
-          <w:sz w:val="22"/>
-          <w:szCs w:val="22"/>
-        </w:rPr>
-        <w:tab/>
-      </w:r>
-      <w:r>
-        <w:rPr>
-          <w:b/>
-          <w:sz w:val="22"/>
-          <w:szCs w:val="22"/>
-        </w:rPr>
-        <w:tab/>
-        <w:t>Регистр:</w:t>
+        <w:t>Регистр</w:t>
+      </w:r>
+      <w:r>
+        <w:rPr>
+          <w:b/>
+          <w:sz w:val="22"/>
+          <w:szCs w:val="22"/>
+        </w:rPr>
+        <w:t>:</w:t>
+      </w:r>
+      <w:r>
+        <w:rPr>
+          <w:b/>
+          <w:sz w:val="22"/>
+          <w:szCs w:val="22"/>
+        </w:rPr>
+        <w:tab/>
+      </w:r>
+      <w:r>
+        <w:rPr>
+          <w:b/>
+          <w:sz w:val="22"/>
+          <w:szCs w:val="22"/>
+        </w:rPr>
+        <w:tab/>
+      </w:r>
+      <w:r>
+        <w:rPr>
+          <w:b/>
+          <w:sz w:val="22"/>
+          <w:szCs w:val="22"/>
+        </w:rPr>
+        <w:tab/>
+      </w:r>
+      <w:r>
+        <w:rPr>
+          <w:b/>
+          <w:sz w:val="22"/>
+          <w:szCs w:val="22"/>
+        </w:rPr>
+        <w:tab/>
+      </w:r>
+      <w:r>
+        <w:rPr>
+          <w:b/>
+          <w:sz w:val="22"/>
+          <w:szCs w:val="22"/>
+        </w:rPr>
+        <w:tab/>
+      </w:r>
+      <w:r>
+        <w:rPr>
+          <w:b/>
+          <w:sz w:val="22"/>
+          <w:szCs w:val="22"/>
+        </w:rPr>
+        <w:tab/>
+      </w:r>
+      <w:r>
+        <w:rPr>
+          <w:b/>
+          <w:sz w:val="22"/>
+          <w:szCs w:val="22"/>
+        </w:rPr>
+        <w:tab/>
+      </w:r>
+      <w:r>
+        <w:rPr>
+          <w:b/>
+          <w:sz w:val="22"/>
+          <w:szCs w:val="22"/>
+        </w:rPr>
+        <w:t>Заказчик</w:t>
+      </w:r>
+      <w:r>
+        <w:rPr>
+          <w:b/>
+          <w:sz w:val="22"/>
+          <w:szCs w:val="22"/>
+        </w:rPr>
+        <w:t>:</w:t>
       </w:r>
     </w:p>
     <w:tbl>
@@ -3215,7 +3237,7 @@
                 <w:szCs w:val="22"/>
                 <w:lang w:val="en-US"/>
               </w:rPr>
-              <w:t>applicant</w:t>
+              <w:t>surveyor</w:t>
             </w:r>
             <w:proofErr w:type="gramEnd"/>
             <w:r>
@@ -3341,7 +3363,7 @@
                 <w:szCs w:val="22"/>
                 <w:lang w:val="en-US"/>
               </w:rPr>
-              <w:t>surveyor</w:t>
+              <w:t>applicant</w:t>
             </w:r>
             <w:proofErr w:type="gramEnd"/>
             <w:r>
@@ -3540,6 +3562,8 @@
         </w:rPr>
         <w:t>МП</w:t>
       </w:r>
+      <w:bookmarkStart w:id="0" w:name="_GoBack"/>
+      <w:bookmarkEnd w:id="0"/>
       <w:r>
         <w:rPr>
           <w:b/>
@@ -4584,7 +4608,7 @@
 </file>
 
 <file path=customXml/itemProps1.xml><?xml version="1.0" encoding="utf-8"?>
-<ds:datastoreItem xmlns:ds="http://schemas.openxmlformats.org/officeDocument/2006/customXml" ds:itemID="{8BCD871D-8C02-4C77-8B80-B877850AF041}">
+<ds:datastoreItem xmlns:ds="http://schemas.openxmlformats.org/officeDocument/2006/customXml" ds:itemID="{B211539D-828B-467A-9455-8F590EB003AA}">
   <ds:schemaRefs>
     <ds:schemaRef ds:uri="http://schemas.openxmlformats.org/officeDocument/2006/bibliography"/>
   </ds:schemaRefs>

</xml_diff>